<commit_message>
feat: add support for relative image
</commit_message>
<xml_diff>
--- a/template/basic.docx
+++ b/template/basic.docx
@@ -61,6 +61,7 @@
       <w:sdtPr>
         <w:rPr>
           <w:rFonts w:ascii="CG Omega" w:eastAsia="CG Omega" w:hAnsi="CG Omega" w:cs="CG Omega"/>
+          <w:b w:val="0"/>
           <w:noProof/>
           <w:sz w:val="20"/>
           <w:szCs w:val="20"/>
@@ -75,7 +76,6 @@
       <w:sdtEndPr>
         <w:rPr>
           <w:rFonts w:asciiTheme="minorHAnsi" w:hAnsiTheme="minorHAnsi"/>
-          <w:b/>
           <w:bCs/>
         </w:rPr>
       </w:sdtEndPr>
@@ -1043,7 +1043,7 @@
     </w:pPr>
     <w:r>
       <w:pict w14:anchorId="1BDA67E9">
-        <v:rect id="Rounded Rectangle 23" o:spid="_x0000_s1033" style="position:absolute;left:0;text-align:left;margin-left:.05pt;margin-top:13.55pt;width:197.5pt;height:22.95pt;z-index:251663360;visibility:visible;v-text-anchor:middle" filled="f" fillcolor="black [3213]" stroked="f">
+        <v:rect id="Rounded Rectangle 23" o:spid="_x0000_s1033" style="position:absolute;left:0;text-align:left;margin-left:.05pt;margin-top:13.05pt;width:197.5pt;height:22.95pt;z-index:251663360;visibility:visible;v-text-anchor:middle" filled="f" fillcolor="black [3213]" stroked="f">
           <v:textbox style="mso-next-textbox:#Rounded Rectangle 23" inset="2.53958mm,1.2694mm,2.53958mm,1.2694mm">
             <w:txbxContent>
               <w:p>
@@ -1870,7 +1870,7 @@
     <w:link w:val="TitleChar"/>
     <w:uiPriority w:val="10"/>
     <w:qFormat/>
-    <w:rsid w:val="000B427B"/>
+    <w:rsid w:val="005C2AEF"/>
     <w:pPr>
       <w:pBdr>
         <w:bottom w:val="single" w:sz="24" w:space="5" w:color="auto"/>
@@ -1882,7 +1882,8 @@
       <w:textboxTightWrap w:val="allLines"/>
     </w:pPr>
     <w:rPr>
-      <w:rFonts w:ascii="Nunito Sans Black" w:hAnsi="Nunito Sans Black" w:cs="Tahoma"/>
+      <w:rFonts w:asciiTheme="majorHAnsi" w:hAnsiTheme="majorHAnsi" w:cs="Tahoma"/>
+      <w:b/>
       <w:bCs/>
       <w:sz w:val="52"/>
       <w:szCs w:val="32"/>
@@ -1894,9 +1895,10 @@
     <w:basedOn w:val="DefaultParagraphFont"/>
     <w:link w:val="Title"/>
     <w:uiPriority w:val="10"/>
-    <w:rsid w:val="000B427B"/>
-    <w:rPr>
-      <w:rFonts w:ascii="Nunito Sans Black" w:hAnsi="Nunito Sans Black" w:cs="Tahoma"/>
+    <w:rsid w:val="005C2AEF"/>
+    <w:rPr>
+      <w:rFonts w:asciiTheme="majorHAnsi" w:hAnsiTheme="majorHAnsi" w:cs="Tahoma"/>
+      <w:b/>
       <w:bCs/>
       <w:noProof/>
       <w:sz w:val="52"/>
@@ -1911,13 +1913,13 @@
     <w:link w:val="SubtitleChar"/>
     <w:uiPriority w:val="11"/>
     <w:qFormat/>
-    <w:rsid w:val="003E2F62"/>
+    <w:rsid w:val="0028743E"/>
     <w:pPr>
       <w:spacing w:before="0" w:after="480"/>
       <w:jc w:val="left"/>
     </w:pPr>
     <w:rPr>
-      <w:rFonts w:ascii="Nunito Sans ExtraBold" w:eastAsia="Tahoma" w:hAnsi="Nunito Sans ExtraBold" w:cs="Tahoma"/>
+      <w:rFonts w:eastAsia="Tahoma" w:cs="Tahoma"/>
       <w:b/>
       <w:sz w:val="32"/>
     </w:rPr>
@@ -1927,9 +1929,9 @@
     <w:basedOn w:val="DefaultParagraphFont"/>
     <w:link w:val="Subtitle"/>
     <w:uiPriority w:val="11"/>
-    <w:rsid w:val="003E2F62"/>
-    <w:rPr>
-      <w:rFonts w:ascii="Nunito Sans ExtraBold" w:eastAsia="Tahoma" w:hAnsi="Nunito Sans ExtraBold" w:cs="Tahoma"/>
+    <w:rsid w:val="0028743E"/>
+    <w:rPr>
+      <w:rFonts w:asciiTheme="minorHAnsi" w:eastAsia="Tahoma" w:hAnsiTheme="minorHAnsi" w:cs="Tahoma"/>
       <w:b/>
       <w:noProof/>
       <w:sz w:val="32"/>
@@ -2215,10 +2217,10 @@
     <w:next w:val="Normal"/>
     <w:link w:val="CaptionChar"/>
     <w:qFormat/>
-    <w:rsid w:val="00115923"/>
+    <w:rsid w:val="00DC1E70"/>
     <w:pPr>
       <w:spacing w:before="120" w:after="120"/>
-      <w:jc w:val="center"/>
+      <w:jc w:val="left"/>
     </w:pPr>
     <w:rPr>
       <w:rFonts w:ascii="Avenir LT Pro 55 Roman" w:hAnsi="Avenir LT Pro 55 Roman"/>
@@ -2251,6 +2253,7 @@
     <w:name w:val="Caption Char"/>
     <w:basedOn w:val="DefaultParagraphFont"/>
     <w:link w:val="Caption"/>
+    <w:rsid w:val="00DC1E70"/>
     <w:rPr>
       <w:rFonts w:ascii="Avenir LT Pro 55 Roman" w:hAnsi="Avenir LT Pro 55 Roman"/>
       <w:b/>
@@ -2311,7 +2314,7 @@
     <w:uiPriority w:val="39"/>
     <w:unhideWhenUsed/>
     <w:qFormat/>
-    <w:rsid w:val="00A663FE"/>
+    <w:rsid w:val="00063683"/>
     <w:pPr>
       <w:keepNext/>
       <w:keepLines/>
@@ -2327,8 +2330,7 @@
       <w:outlineLvl w:val="9"/>
     </w:pPr>
     <w:rPr>
-      <w:rFonts w:eastAsiaTheme="majorEastAsia" w:cstheme="majorBidi"/>
-      <w:b w:val="0"/>
+      <w:rFonts w:asciiTheme="majorHAnsi" w:eastAsiaTheme="majorEastAsia" w:hAnsiTheme="majorHAnsi" w:cstheme="majorBidi"/>
       <w:bCs w:val="0"/>
       <w:noProof w:val="0"/>
       <w:color w:val="auto"/>

</xml_diff>